<commit_message>
added code to create images and the like
</commit_message>
<xml_diff>
--- a/Paper/Liver_Disease_Paper/Frontiers/Figures.docx
+++ b/Paper/Liver_Disease_Paper/Frontiers/Figures.docx
@@ -1,6 +1,6 @@
 
 <file path=word/document.xml><?xml version="1.0" encoding="utf-8"?>
-<w:document xmlns:wpc="http://schemas.microsoft.com/office/word/2010/wordprocessingCanvas" xmlns:cx="http://schemas.microsoft.com/office/drawing/2014/chartex" xmlns:cx1="http://schemas.microsoft.com/office/drawing/2015/9/8/chartex" xmlns:mc="http://schemas.openxmlformats.org/markup-compatibility/2006" xmlns:o="urn:schemas-microsoft-com:office:office" xmlns:r="http://schemas.openxmlformats.org/officeDocument/2006/relationships" xmlns:m="http://schemas.openxmlformats.org/officeDocument/2006/math" xmlns:v="urn:schemas-microsoft-com:vml" xmlns:wp14="http://schemas.microsoft.com/office/word/2010/wordprocessingDrawing" xmlns:wp="http://schemas.openxmlformats.org/drawingml/2006/wordprocessingDrawing" xmlns:w10="urn:schemas-microsoft-com:office:word" xmlns:w="http://schemas.openxmlformats.org/wordprocessingml/2006/main" xmlns:w14="http://schemas.microsoft.com/office/word/2010/wordml" xmlns:w15="http://schemas.microsoft.com/office/word/2012/wordml" xmlns:w16se="http://schemas.microsoft.com/office/word/2015/wordml/symex" xmlns:wpg="http://schemas.microsoft.com/office/word/2010/wordprocessingGroup" xmlns:wpi="http://schemas.microsoft.com/office/word/2010/wordprocessingInk" xmlns:wne="http://schemas.microsoft.com/office/word/2006/wordml" xmlns:wps="http://schemas.microsoft.com/office/word/2010/wordprocessingShape" mc:Ignorable="w14 w15 w16se wp14">
+<w:document xmlns:wpc="http://schemas.microsoft.com/office/word/2010/wordprocessingCanvas" xmlns:cx="http://schemas.microsoft.com/office/drawing/2014/chartex" xmlns:cx1="http://schemas.microsoft.com/office/drawing/2015/9/8/chartex" xmlns:cx2="http://schemas.microsoft.com/office/drawing/2015/10/21/chartex" xmlns:cx3="http://schemas.microsoft.com/office/drawing/2016/5/9/chartex" xmlns:cx4="http://schemas.microsoft.com/office/drawing/2016/5/10/chartex" xmlns:cx5="http://schemas.microsoft.com/office/drawing/2016/5/11/chartex" xmlns:cx6="http://schemas.microsoft.com/office/drawing/2016/5/12/chartex" xmlns:cx7="http://schemas.microsoft.com/office/drawing/2016/5/13/chartex" xmlns:cx8="http://schemas.microsoft.com/office/drawing/2016/5/14/chartex" xmlns:mc="http://schemas.openxmlformats.org/markup-compatibility/2006" xmlns:aink="http://schemas.microsoft.com/office/drawing/2016/ink" xmlns:am3d="http://schemas.microsoft.com/office/drawing/2017/model3d" xmlns:o="urn:schemas-microsoft-com:office:office" xmlns:oel="http://schemas.microsoft.com/office/2019/extlst" xmlns:r="http://schemas.openxmlformats.org/officeDocument/2006/relationships" xmlns:m="http://schemas.openxmlformats.org/officeDocument/2006/math" xmlns:v="urn:schemas-microsoft-com:vml" xmlns:wp14="http://schemas.microsoft.com/office/word/2010/wordprocessingDrawing" xmlns:wp="http://schemas.openxmlformats.org/drawingml/2006/wordprocessingDrawing" xmlns:w10="urn:schemas-microsoft-com:office:word" xmlns:w="http://schemas.openxmlformats.org/wordprocessingml/2006/main" xmlns:w14="http://schemas.microsoft.com/office/word/2010/wordml" xmlns:w15="http://schemas.microsoft.com/office/word/2012/wordml" xmlns:w16cex="http://schemas.microsoft.com/office/word/2018/wordml/cex" xmlns:w16cid="http://schemas.microsoft.com/office/word/2016/wordml/cid" xmlns:w16="http://schemas.microsoft.com/office/word/2018/wordml" xmlns:w16sdtdh="http://schemas.microsoft.com/office/word/2020/wordml/sdtdatahash" xmlns:w16se="http://schemas.microsoft.com/office/word/2015/wordml/symex" xmlns:wpg="http://schemas.microsoft.com/office/word/2010/wordprocessingGroup" xmlns:wpi="http://schemas.microsoft.com/office/word/2010/wordprocessingInk" xmlns:wne="http://schemas.microsoft.com/office/word/2006/wordml" xmlns:wps="http://schemas.microsoft.com/office/word/2010/wordprocessingShape" mc:Ignorable="w14 w15 w16se w16cid w16 w16cex w16sdtdh wp14">
   <w:body>
     <w:p>
       <w:pPr>
@@ -16,55 +16,238 @@
       <w:r>
         <w:rPr>
           <w:rFonts w:ascii="Arial" w:hAnsi="Arial" w:cs="Arial"/>
-          <w:noProof/>
-          <w:sz w:val="16"/>
-          <w:szCs w:val="16"/>
-        </w:rPr>
-        <w:drawing>
-          <wp:inline distT="0" distB="0" distL="0" distR="0" wp14:anchorId="744E2B8F" wp14:editId="75E9F386">
-            <wp:extent cx="4661206" cy="2743200"/>
-            <wp:effectExtent l="0" t="0" r="6350" b="0"/>
-            <wp:docPr id="280" name="Picture 280"/>
-            <wp:cNvGraphicFramePr>
-              <a:graphicFrameLocks xmlns:a="http://schemas.openxmlformats.org/drawingml/2006/main" noChangeAspect="1"/>
-            </wp:cNvGraphicFramePr>
-            <a:graphic xmlns:a="http://schemas.openxmlformats.org/drawingml/2006/main">
-              <a:graphicData uri="http://schemas.openxmlformats.org/drawingml/2006/picture">
-                <pic:pic xmlns:pic="http://schemas.openxmlformats.org/drawingml/2006/picture">
-                  <pic:nvPicPr>
-                    <pic:cNvPr id="0" name="Picture 11"/>
-                    <pic:cNvPicPr>
-                      <a:picLocks noChangeAspect="1" noChangeArrowheads="1"/>
-                    </pic:cNvPicPr>
-                  </pic:nvPicPr>
-                  <pic:blipFill>
-                    <a:blip r:embed="rId4" cstate="print">
-                      <a:extLst>
-                        <a:ext uri="{28A0092B-C50C-407E-A947-70E740481C1C}">
-                          <a14:useLocalDpi xmlns:a14="http://schemas.microsoft.com/office/drawing/2010/main" val="0"/>
-                        </a:ext>
-                      </a:extLst>
-                    </a:blip>
-                    <a:srcRect/>
-                    <a:stretch>
-                      <a:fillRect/>
-                    </a:stretch>
-                  </pic:blipFill>
-                  <pic:spPr bwMode="auto">
-                    <a:xfrm>
-                      <a:off x="0" y="0"/>
-                      <a:ext cx="4661206" cy="2743200"/>
-                    </a:xfrm>
-                    <a:prstGeom prst="rect">
-                      <a:avLst/>
-                    </a:prstGeom>
-                    <a:noFill/>
-                  </pic:spPr>
-                </pic:pic>
-              </a:graphicData>
-            </a:graphic>
-          </wp:inline>
-        </w:drawing>
+          <w:sz w:val="16"/>
+          <w:szCs w:val="16"/>
+        </w:rPr>
+        <mc:AlternateContent>
+          <mc:Choice Requires="wpg">
+            <w:drawing>
+              <wp:inline distT="0" distB="0" distL="0" distR="0" wp14:anchorId="73787A8C" wp14:editId="1E1AFFA9">
+                <wp:extent cx="5027773" cy="2402925"/>
+                <wp:effectExtent l="0" t="0" r="1905" b="0"/>
+                <wp:docPr id="2" name="Group 80"/>
+                <wp:cNvGraphicFramePr xmlns:a="http://schemas.openxmlformats.org/drawingml/2006/main"/>
+                <a:graphic xmlns:a="http://schemas.openxmlformats.org/drawingml/2006/main">
+                  <a:graphicData uri="http://schemas.microsoft.com/office/word/2010/wordprocessingGroup">
+                    <wpg:wgp>
+                      <wpg:cNvGrpSpPr/>
+                      <wpg:grpSpPr>
+                        <a:xfrm>
+                          <a:off x="0" y="0"/>
+                          <a:ext cx="5027773" cy="2402925"/>
+                          <a:chOff x="0" y="0"/>
+                          <a:chExt cx="5027773" cy="2402925"/>
+                        </a:xfrm>
+                      </wpg:grpSpPr>
+                      <pic:pic xmlns:pic="http://schemas.openxmlformats.org/drawingml/2006/picture">
+                        <pic:nvPicPr>
+                          <pic:cNvPr id="3" name="Picture 3"/>
+                          <pic:cNvPicPr>
+                            <a:picLocks noChangeAspect="1"/>
+                          </pic:cNvPicPr>
+                        </pic:nvPicPr>
+                        <pic:blipFill>
+                          <a:blip r:embed="rId4"/>
+                          <a:stretch>
+                            <a:fillRect/>
+                          </a:stretch>
+                        </pic:blipFill>
+                        <pic:spPr>
+                          <a:xfrm>
+                            <a:off x="1662448" y="0"/>
+                            <a:ext cx="1703808" cy="2335464"/>
+                          </a:xfrm>
+                          <a:prstGeom prst="rect">
+                            <a:avLst/>
+                          </a:prstGeom>
+                        </pic:spPr>
+                      </pic:pic>
+                      <pic:pic xmlns:pic="http://schemas.openxmlformats.org/drawingml/2006/picture">
+                        <pic:nvPicPr>
+                          <pic:cNvPr id="4" name="Picture 4"/>
+                          <pic:cNvPicPr>
+                            <a:picLocks noChangeAspect="1"/>
+                          </pic:cNvPicPr>
+                        </pic:nvPicPr>
+                        <pic:blipFill>
+                          <a:blip r:embed="rId5"/>
+                          <a:stretch>
+                            <a:fillRect/>
+                          </a:stretch>
+                        </pic:blipFill>
+                        <pic:spPr>
+                          <a:xfrm>
+                            <a:off x="0" y="355"/>
+                            <a:ext cx="1647393" cy="2337188"/>
+                          </a:xfrm>
+                          <a:prstGeom prst="rect">
+                            <a:avLst/>
+                          </a:prstGeom>
+                        </pic:spPr>
+                      </pic:pic>
+                      <pic:pic xmlns:pic="http://schemas.openxmlformats.org/drawingml/2006/picture">
+                        <pic:nvPicPr>
+                          <pic:cNvPr id="6" name="Picture 6"/>
+                          <pic:cNvPicPr>
+                            <a:picLocks noChangeAspect="1"/>
+                          </pic:cNvPicPr>
+                        </pic:nvPicPr>
+                        <pic:blipFill rotWithShape="1">
+                          <a:blip r:embed="rId6"/>
+                          <a:srcRect l="11205" r="8514"/>
+                          <a:stretch/>
+                        </pic:blipFill>
+                        <pic:spPr>
+                          <a:xfrm>
+                            <a:off x="4273393" y="1651188"/>
+                            <a:ext cx="754380" cy="751737"/>
+                          </a:xfrm>
+                          <a:prstGeom prst="rect">
+                            <a:avLst/>
+                          </a:prstGeom>
+                        </pic:spPr>
+                      </pic:pic>
+                      <pic:pic xmlns:pic="http://schemas.openxmlformats.org/drawingml/2006/picture">
+                        <pic:nvPicPr>
+                          <pic:cNvPr id="7" name="Picture 7"/>
+                          <pic:cNvPicPr>
+                            <a:picLocks noChangeAspect="1"/>
+                          </pic:cNvPicPr>
+                        </pic:nvPicPr>
+                        <pic:blipFill>
+                          <a:blip r:embed="rId7"/>
+                          <a:stretch>
+                            <a:fillRect/>
+                          </a:stretch>
+                        </pic:blipFill>
+                        <pic:spPr>
+                          <a:xfrm>
+                            <a:off x="4277736" y="868603"/>
+                            <a:ext cx="745695" cy="762452"/>
+                          </a:xfrm>
+                          <a:prstGeom prst="rect">
+                            <a:avLst/>
+                          </a:prstGeom>
+                        </pic:spPr>
+                      </pic:pic>
+                      <pic:pic xmlns:pic="http://schemas.openxmlformats.org/drawingml/2006/picture">
+                        <pic:nvPicPr>
+                          <pic:cNvPr id="9" name="Picture 9"/>
+                          <pic:cNvPicPr>
+                            <a:picLocks noChangeAspect="1"/>
+                          </pic:cNvPicPr>
+                        </pic:nvPicPr>
+                        <pic:blipFill>
+                          <a:blip r:embed="rId8"/>
+                          <a:stretch>
+                            <a:fillRect/>
+                          </a:stretch>
+                        </pic:blipFill>
+                        <pic:spPr>
+                          <a:xfrm>
+                            <a:off x="4274346" y="716"/>
+                            <a:ext cx="752475" cy="857250"/>
+                          </a:xfrm>
+                          <a:prstGeom prst="rect">
+                            <a:avLst/>
+                          </a:prstGeom>
+                        </pic:spPr>
+                      </pic:pic>
+                      <wps:wsp>
+                        <wps:cNvPr id="10" name="Right Arrow 92"/>
+                        <wps:cNvSpPr/>
+                        <wps:spPr>
+                          <a:xfrm>
+                            <a:off x="3399086" y="1037873"/>
+                            <a:ext cx="845820" cy="415846"/>
+                          </a:xfrm>
+                          <a:prstGeom prst="rightArrow">
+                            <a:avLst/>
+                          </a:prstGeom>
+                        </wps:spPr>
+                        <wps:style>
+                          <a:lnRef idx="2">
+                            <a:schemeClr val="accent1">
+                              <a:shade val="50000"/>
+                            </a:schemeClr>
+                          </a:lnRef>
+                          <a:fillRef idx="1">
+                            <a:schemeClr val="accent1"/>
+                          </a:fillRef>
+                          <a:effectRef idx="0">
+                            <a:schemeClr val="accent1"/>
+                          </a:effectRef>
+                          <a:fontRef idx="minor">
+                            <a:schemeClr val="lt1"/>
+                          </a:fontRef>
+                        </wps:style>
+                        <wps:bodyPr rtlCol="0" anchor="ctr"/>
+                      </wps:wsp>
+                    </wpg:wgp>
+                  </a:graphicData>
+                </a:graphic>
+              </wp:inline>
+            </w:drawing>
+          </mc:Choice>
+          <mc:Fallback>
+            <w:pict>
+              <v:group w14:anchorId="6A1F61D5" id="Group 80" o:spid="_x0000_s1026" style="width:395.9pt;height:189.2pt;mso-position-horizontal-relative:char;mso-position-vertical-relative:line" coordsize="50277,24029" o:gfxdata="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">
+                <v:shapetype id="_x0000_t75" coordsize="21600,21600" o:spt="75" o:preferrelative="t" path="m@4@5l@4@11@9@11@9@5xe" filled="f" stroked="f">
+                  <v:stroke joinstyle="miter"/>
+                  <v:formulas>
+                    <v:f eqn="if lineDrawn pixelLineWidth 0"/>
+                    <v:f eqn="sum @0 1 0"/>
+                    <v:f eqn="sum 0 0 @1"/>
+                    <v:f eqn="prod @2 1 2"/>
+                    <v:f eqn="prod @3 21600 pixelWidth"/>
+                    <v:f eqn="prod @3 21600 pixelHeight"/>
+                    <v:f eqn="sum @0 0 1"/>
+                    <v:f eqn="prod @6 1 2"/>
+                    <v:f eqn="prod @7 21600 pixelWidth"/>
+                    <v:f eqn="sum @8 21600 0"/>
+                    <v:f eqn="prod @7 21600 pixelHeight"/>
+                    <v:f eqn="sum @10 21600 0"/>
+                  </v:formulas>
+                  <v:path o:extrusionok="f" gradientshapeok="t" o:connecttype="rect"/>
+                  <o:lock v:ext="edit" aspectratio="t"/>
+                </v:shapetype>
+                <v:shape id="Picture 3" o:spid="_x0000_s1027" type="#_x0000_t75" style="position:absolute;left:16624;width:17038;height:23354;visibility:visible;mso-wrap-style:square" o:gfxdata="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">
+                  <v:imagedata r:id="rId9" o:title=""/>
+                </v:shape>
+                <v:shape id="Picture 4" o:spid="_x0000_s1028" type="#_x0000_t75" style="position:absolute;top:3;width:16473;height:23372;visibility:visible;mso-wrap-style:square" o:gfxdata="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">
+                  <v:imagedata r:id="rId10" o:title=""/>
+                </v:shape>
+                <v:shape id="Picture 6" o:spid="_x0000_s1029" type="#_x0000_t75" style="position:absolute;left:42733;top:16511;width:7544;height:7518;visibility:visible;mso-wrap-style:square" o:gfxdata="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">
+                  <v:imagedata r:id="rId11" o:title="" cropleft="7343f" cropright="5580f"/>
+                </v:shape>
+                <v:shape id="Picture 7" o:spid="_x0000_s1030" type="#_x0000_t75" style="position:absolute;left:42777;top:8686;width:7457;height:7624;visibility:visible;mso-wrap-style:square" o:gfxdata="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">
+                  <v:imagedata r:id="rId12" o:title=""/>
+                </v:shape>
+                <v:shape id="Picture 9" o:spid="_x0000_s1031" type="#_x0000_t75" style="position:absolute;left:42743;top:7;width:7525;height:8572;visibility:visible;mso-wrap-style:square" o:gfxdata="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">
+                  <v:imagedata r:id="rId13" o:title=""/>
+                </v:shape>
+                <v:shapetype id="_x0000_t13" coordsize="21600,21600" o:spt="13" adj="16200,5400" path="m@0,l@0@1,0@1,0@2@0@2@0,21600,21600,10800xe">
+                  <v:stroke joinstyle="miter"/>
+                  <v:formulas>
+                    <v:f eqn="val #0"/>
+                    <v:f eqn="val #1"/>
+                    <v:f eqn="sum height 0 #1"/>
+                    <v:f eqn="sum 10800 0 #1"/>
+                    <v:f eqn="sum width 0 #0"/>
+                    <v:f eqn="prod @4 @3 10800"/>
+                    <v:f eqn="sum width 0 @5"/>
+                  </v:formulas>
+                  <v:path o:connecttype="custom" o:connectlocs="@0,0;0,10800;@0,21600;21600,10800" o:connectangles="270,180,90,0" textboxrect="0,@1,@6,@2"/>
+                  <v:handles>
+                    <v:h position="#0,#1" xrange="0,21600" yrange="0,10800"/>
+                  </v:handles>
+                </v:shapetype>
+                <v:shape id="Right Arrow 92" o:spid="_x0000_s1032" type="#_x0000_t13" style="position:absolute;left:33990;top:10378;width:8459;height:4159;visibility:visible;mso-wrap-style:square;v-text-anchor:middle" o:gfxdata="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" adj="16290" fillcolor="#4472c4 [3204]" strokecolor="#1f3763 [1604]" strokeweight="1pt"/>
+                <w10:anchorlock/>
+              </v:group>
+            </w:pict>
+          </mc:Fallback>
+        </mc:AlternateContent>
       </w:r>
     </w:p>
     <w:p>
@@ -166,97 +349,39 @@
           <w:sz w:val="16"/>
           <w:szCs w:val="16"/>
         </w:rPr>
-        <w:t xml:space="preserve"> Liver distributed into individual cubes of 32x120x120. Disease </w:t>
-      </w:r>
-      <w:r>
-        <w:rPr>
-          <w:rFonts w:ascii="Arial" w:hAnsi="Arial" w:cs="Arial"/>
-          <w:i w:val="0"/>
-          <w:color w:val="auto"/>
-          <w:sz w:val="16"/>
-          <w:szCs w:val="16"/>
-        </w:rPr>
-        <w:t>was</w:t>
-      </w:r>
-      <w:r>
-        <w:rPr>
-          <w:rFonts w:ascii="Arial" w:hAnsi="Arial" w:cs="Arial"/>
-          <w:i w:val="0"/>
-          <w:color w:val="auto"/>
-          <w:sz w:val="16"/>
-          <w:szCs w:val="16"/>
-        </w:rPr>
-        <w:t xml:space="preserve"> </w:t>
-      </w:r>
-      <w:r>
-        <w:rPr>
-          <w:rFonts w:ascii="Arial" w:hAnsi="Arial" w:cs="Arial"/>
-          <w:i w:val="0"/>
-          <w:color w:val="auto"/>
-          <w:sz w:val="16"/>
-          <w:szCs w:val="16"/>
-        </w:rPr>
-        <w:t>labeled as disease</w:t>
-      </w:r>
-      <w:r>
-        <w:rPr>
-          <w:rFonts w:ascii="Arial" w:hAnsi="Arial" w:cs="Arial"/>
-          <w:i w:val="0"/>
-          <w:color w:val="auto"/>
-          <w:sz w:val="16"/>
-          <w:szCs w:val="16"/>
-        </w:rPr>
-        <w:t>,</w:t>
-      </w:r>
-      <w:r>
-        <w:rPr>
-          <w:rFonts w:ascii="Arial" w:hAnsi="Arial" w:cs="Arial"/>
-          <w:i w:val="0"/>
-          <w:color w:val="auto"/>
-          <w:sz w:val="16"/>
-          <w:szCs w:val="16"/>
-        </w:rPr>
-        <w:t xml:space="preserve"> regardless of </w:t>
-      </w:r>
-      <w:r>
-        <w:rPr>
-          <w:rFonts w:ascii="Arial" w:hAnsi="Arial" w:cs="Arial"/>
-          <w:i w:val="0"/>
-          <w:color w:val="auto"/>
-          <w:sz w:val="16"/>
-          <w:szCs w:val="16"/>
-        </w:rPr>
-        <w:t xml:space="preserve">the </w:t>
-      </w:r>
-      <w:r>
-        <w:rPr>
-          <w:rFonts w:ascii="Arial" w:hAnsi="Arial" w:cs="Arial"/>
-          <w:i w:val="0"/>
-          <w:color w:val="auto"/>
-          <w:sz w:val="16"/>
-          <w:szCs w:val="16"/>
-        </w:rPr>
-        <w:t xml:space="preserve">center of </w:t>
-      </w:r>
-      <w:r>
-        <w:rPr>
-          <w:rFonts w:ascii="Arial" w:hAnsi="Arial" w:cs="Arial"/>
-          <w:i w:val="0"/>
-          <w:color w:val="auto"/>
-          <w:sz w:val="16"/>
-          <w:szCs w:val="16"/>
-        </w:rPr>
-        <w:t xml:space="preserve">the </w:t>
-      </w:r>
-      <w:r>
-        <w:rPr>
-          <w:rFonts w:ascii="Arial" w:hAnsi="Arial" w:cs="Arial"/>
-          <w:i w:val="0"/>
-          <w:color w:val="auto"/>
-          <w:sz w:val="16"/>
-          <w:szCs w:val="16"/>
-        </w:rPr>
-        <w:t>cube.</w:t>
+        <w:t xml:space="preserve"> Liver distributed into individual cubes of 32x120x120. </w:t>
+      </w:r>
+      <w:r>
+        <w:rPr>
+          <w:rFonts w:ascii="Arial" w:hAnsi="Arial" w:cs="Arial"/>
+          <w:i w:val="0"/>
+          <w:color w:val="auto"/>
+          <w:sz w:val="16"/>
+          <w:szCs w:val="16"/>
+        </w:rPr>
+        <w:t xml:space="preserve">Ground truth of disease was provided by </w:t>
+      </w:r>
+      <w:proofErr w:type="spellStart"/>
+      <w:r>
+        <w:rPr>
+          <w:rFonts w:ascii="Arial" w:hAnsi="Arial" w:cs="Arial"/>
+          <w:i w:val="0"/>
+          <w:color w:val="auto"/>
+          <w:sz w:val="16"/>
+          <w:szCs w:val="16"/>
+        </w:rPr>
+        <w:t>LiTs</w:t>
+      </w:r>
+      <w:proofErr w:type="spellEnd"/>
+      <w:r>
+        <w:rPr>
+          <w:rFonts w:ascii="Arial" w:hAnsi="Arial" w:cs="Arial"/>
+          <w:i w:val="0"/>
+          <w:color w:val="auto"/>
+          <w:sz w:val="16"/>
+          <w:szCs w:val="16"/>
+        </w:rPr>
+        <w:t xml:space="preserve"> challenge.</w:t>
       </w:r>
       <w:r>
         <w:rPr>
@@ -362,6 +487,7 @@
     <w:p>
       <w:pPr>
         <w:keepNext/>
+        <w:pageBreakBefore/>
         <w:spacing w:after="0" w:line="240" w:lineRule="auto"/>
         <w:contextualSpacing/>
         <w:rPr>
@@ -379,7 +505,7 @@
         </w:rPr>
         <w:lastRenderedPageBreak/>
         <w:drawing>
-          <wp:inline distT="0" distB="0" distL="0" distR="0" wp14:anchorId="0FF8A56F" wp14:editId="50EF3BC9">
+          <wp:inline distT="0" distB="0" distL="0" distR="0" wp14:anchorId="674FF91F" wp14:editId="0214FD8C">
             <wp:extent cx="6455430" cy="5081237"/>
             <wp:effectExtent l="0" t="0" r="2540" b="5715"/>
             <wp:docPr id="5" name="Picture 5"/>
@@ -396,7 +522,7 @@
                     </pic:cNvPicPr>
                   </pic:nvPicPr>
                   <pic:blipFill>
-                    <a:blip r:embed="rId5" cstate="print">
+                    <a:blip r:embed="rId14" cstate="print">
                       <a:extLst>
                         <a:ext uri="{28A0092B-C50C-407E-A947-70E740481C1C}">
                           <a14:useLocalDpi xmlns:a14="http://schemas.microsoft.com/office/drawing/2010/main" val="0"/>
@@ -658,7 +784,7 @@
         </w:rPr>
         <w:lastRenderedPageBreak/>
         <w:drawing>
-          <wp:inline distT="0" distB="0" distL="0" distR="0" wp14:anchorId="676E8715">
+          <wp:inline distT="0" distB="0" distL="0" distR="0" wp14:anchorId="7A4F8AD2" wp14:editId="588D8583">
             <wp:extent cx="5923657" cy="2156271"/>
             <wp:effectExtent l="0" t="0" r="1270" b="0"/>
             <wp:docPr id="382" name="Picture 382"/>
@@ -675,7 +801,7 @@
                     </pic:cNvPicPr>
                   </pic:nvPicPr>
                   <pic:blipFill>
-                    <a:blip r:embed="rId6" cstate="print">
+                    <a:blip r:embed="rId15" cstate="print">
                       <a:extLst>
                         <a:ext uri="{28A0092B-C50C-407E-A947-70E740481C1C}">
                           <a14:useLocalDpi xmlns:a14="http://schemas.microsoft.com/office/drawing/2010/main" val="0"/>
@@ -757,13 +883,59 @@
         </w:rPr>
         <w:t>-</w:t>
       </w:r>
-      <w:r>
-        <w:rPr>
-          <w:rFonts w:ascii="Arial" w:hAnsi="Arial" w:cs="Arial"/>
-          <w:sz w:val="16"/>
-          <w:szCs w:val="16"/>
-        </w:rPr>
-        <w:t>WNet. (Left) Pre-trained 2D DenseNet 121 converted into UNet, where final features</w:t>
+      <w:proofErr w:type="spellStart"/>
+      <w:r>
+        <w:rPr>
+          <w:rFonts w:ascii="Arial" w:hAnsi="Arial" w:cs="Arial"/>
+          <w:sz w:val="16"/>
+          <w:szCs w:val="16"/>
+        </w:rPr>
+        <w:t>WNet</w:t>
+      </w:r>
+      <w:proofErr w:type="spellEnd"/>
+      <w:r>
+        <w:rPr>
+          <w:rFonts w:ascii="Arial" w:hAnsi="Arial" w:cs="Arial"/>
+          <w:sz w:val="16"/>
+          <w:szCs w:val="16"/>
+        </w:rPr>
+        <w:t xml:space="preserve">. (Left) Pre-trained 2D </w:t>
+      </w:r>
+      <w:proofErr w:type="spellStart"/>
+      <w:r>
+        <w:rPr>
+          <w:rFonts w:ascii="Arial" w:hAnsi="Arial" w:cs="Arial"/>
+          <w:sz w:val="16"/>
+          <w:szCs w:val="16"/>
+        </w:rPr>
+        <w:t>DenseNet</w:t>
+      </w:r>
+      <w:proofErr w:type="spellEnd"/>
+      <w:r>
+        <w:rPr>
+          <w:rFonts w:ascii="Arial" w:hAnsi="Arial" w:cs="Arial"/>
+          <w:sz w:val="16"/>
+          <w:szCs w:val="16"/>
+        </w:rPr>
+        <w:t xml:space="preserve"> 121 converted into </w:t>
+      </w:r>
+      <w:proofErr w:type="spellStart"/>
+      <w:r>
+        <w:rPr>
+          <w:rFonts w:ascii="Arial" w:hAnsi="Arial" w:cs="Arial"/>
+          <w:sz w:val="16"/>
+          <w:szCs w:val="16"/>
+        </w:rPr>
+        <w:t>UNet</w:t>
+      </w:r>
+      <w:proofErr w:type="spellEnd"/>
+      <w:r>
+        <w:rPr>
+          <w:rFonts w:ascii="Arial" w:hAnsi="Arial" w:cs="Arial"/>
+          <w:sz w:val="16"/>
+          <w:szCs w:val="16"/>
+        </w:rPr>
+        <w:t>, where final features</w:t>
       </w:r>
       <w:r>
         <w:rPr>
@@ -779,7 +951,43 @@
           <w:sz w:val="16"/>
           <w:szCs w:val="16"/>
         </w:rPr>
-        <w:t xml:space="preserve">concatenated into 3D DenseNet. (Right) 3D DenseNet architecture </w:t>
+        <w:t xml:space="preserve">concatenated into 3D </w:t>
+      </w:r>
+      <w:proofErr w:type="spellStart"/>
+      <w:r>
+        <w:rPr>
+          <w:rFonts w:ascii="Arial" w:hAnsi="Arial" w:cs="Arial"/>
+          <w:sz w:val="16"/>
+          <w:szCs w:val="16"/>
+        </w:rPr>
+        <w:t>DenseNet</w:t>
+      </w:r>
+      <w:proofErr w:type="spellEnd"/>
+      <w:r>
+        <w:rPr>
+          <w:rFonts w:ascii="Arial" w:hAnsi="Arial" w:cs="Arial"/>
+          <w:sz w:val="16"/>
+          <w:szCs w:val="16"/>
+        </w:rPr>
+        <w:t xml:space="preserve">. (Right) 3D </w:t>
+      </w:r>
+      <w:proofErr w:type="spellStart"/>
+      <w:r>
+        <w:rPr>
+          <w:rFonts w:ascii="Arial" w:hAnsi="Arial" w:cs="Arial"/>
+          <w:sz w:val="16"/>
+          <w:szCs w:val="16"/>
+        </w:rPr>
+        <w:t>DenseNet</w:t>
+      </w:r>
+      <w:proofErr w:type="spellEnd"/>
+      <w:r>
+        <w:rPr>
+          <w:rFonts w:ascii="Arial" w:hAnsi="Arial" w:cs="Arial"/>
+          <w:sz w:val="16"/>
+          <w:szCs w:val="16"/>
+        </w:rPr>
+        <w:t xml:space="preserve"> architecture </w:t>
       </w:r>
       <w:r>
         <w:rPr>
@@ -914,7 +1122,7 @@
         </w:rPr>
         <w:lastRenderedPageBreak/>
         <w:drawing>
-          <wp:inline distT="0" distB="0" distL="0" distR="0" wp14:anchorId="5E393D76" wp14:editId="54F7B48D">
+          <wp:inline distT="0" distB="0" distL="0" distR="0" wp14:anchorId="4847E0A9" wp14:editId="088286B8">
             <wp:extent cx="5810250" cy="5053965"/>
             <wp:effectExtent l="0" t="0" r="0" b="0"/>
             <wp:docPr id="28" name="Picture 28"/>
@@ -931,7 +1139,7 @@
                     </pic:cNvPicPr>
                   </pic:nvPicPr>
                   <pic:blipFill>
-                    <a:blip r:embed="rId7">
+                    <a:blip r:embed="rId16">
                       <a:extLst>
                         <a:ext uri="{28A0092B-C50C-407E-A947-70E740481C1C}">
                           <a14:useLocalDpi xmlns:a14="http://schemas.microsoft.com/office/drawing/2010/main" val="0"/>
@@ -1058,7 +1266,7 @@
         </w:rPr>
         <w:lastRenderedPageBreak/>
         <w:drawing>
-          <wp:inline distT="0" distB="0" distL="0" distR="0" wp14:anchorId="22F1D29D" wp14:editId="3229A388">
+          <wp:inline distT="0" distB="0" distL="0" distR="0" wp14:anchorId="1276F3B9" wp14:editId="7870C07E">
             <wp:extent cx="5939790" cy="2809240"/>
             <wp:effectExtent l="0" t="0" r="3810" b="0"/>
             <wp:docPr id="1" name="Picture 1"/>
@@ -1075,7 +1283,7 @@
                     </pic:cNvPicPr>
                   </pic:nvPicPr>
                   <pic:blipFill>
-                    <a:blip r:embed="rId8">
+                    <a:blip r:embed="rId17">
                       <a:extLst>
                         <a:ext uri="{28A0092B-C50C-407E-A947-70E740481C1C}">
                           <a14:useLocalDpi xmlns:a14="http://schemas.microsoft.com/office/drawing/2010/main" val="0"/>
@@ -1201,7 +1409,7 @@
         </w:rPr>
         <w:lastRenderedPageBreak/>
         <w:drawing>
-          <wp:inline distT="0" distB="0" distL="0" distR="0" wp14:anchorId="0E8C655E" wp14:editId="3B19808B">
+          <wp:inline distT="0" distB="0" distL="0" distR="0" wp14:anchorId="18959C22" wp14:editId="3E938FA8">
             <wp:extent cx="6542312" cy="5749290"/>
             <wp:effectExtent l="0" t="0" r="0" b="0"/>
             <wp:docPr id="8" name="Picture 8"/>
@@ -1218,7 +1426,7 @@
                     </pic:cNvPicPr>
                   </pic:nvPicPr>
                   <pic:blipFill>
-                    <a:blip r:embed="rId9">
+                    <a:blip r:embed="rId18">
                       <a:extLst>
                         <a:ext uri="{28A0092B-C50C-407E-A947-70E740481C1C}">
                           <a14:useLocalDpi xmlns:a14="http://schemas.microsoft.com/office/drawing/2010/main" val="0"/>
@@ -1302,8 +1510,6 @@
         </w:rPr>
         <w:t xml:space="preserve"> (Top) Likert score by each reviewer for each disease site. (Bottom) Likert score by each reviewer for each ablation site. A higher value is associated with higher quality.</w:t>
       </w:r>
-      <w:bookmarkStart w:id="0" w:name="_GoBack"/>
-      <w:bookmarkEnd w:id="0"/>
     </w:p>
     <w:sectPr>
       <w:pgSz w:w="12240" w:h="15840"/>
@@ -1316,7 +1522,7 @@
 </file>
 
 <file path=word/styles.xml><?xml version="1.0" encoding="utf-8"?>
-<w:styles xmlns:mc="http://schemas.openxmlformats.org/markup-compatibility/2006" xmlns:r="http://schemas.openxmlformats.org/officeDocument/2006/relationships" xmlns:w="http://schemas.openxmlformats.org/wordprocessingml/2006/main" xmlns:w14="http://schemas.microsoft.com/office/word/2010/wordml" xmlns:w15="http://schemas.microsoft.com/office/word/2012/wordml" xmlns:w16se="http://schemas.microsoft.com/office/word/2015/wordml/symex" mc:Ignorable="w14 w15 w16se">
+<w:styles xmlns:mc="http://schemas.openxmlformats.org/markup-compatibility/2006" xmlns:r="http://schemas.openxmlformats.org/officeDocument/2006/relationships" xmlns:w="http://schemas.openxmlformats.org/wordprocessingml/2006/main" xmlns:w14="http://schemas.microsoft.com/office/word/2010/wordml" xmlns:w15="http://schemas.microsoft.com/office/word/2012/wordml" xmlns:w16cex="http://schemas.microsoft.com/office/word/2018/wordml/cex" xmlns:w16cid="http://schemas.microsoft.com/office/word/2016/wordml/cid" xmlns:w16="http://schemas.microsoft.com/office/word/2018/wordml" xmlns:w16sdtdh="http://schemas.microsoft.com/office/word/2020/wordml/sdtdatahash" xmlns:w16se="http://schemas.microsoft.com/office/word/2015/wordml/symex" mc:Ignorable="w14 w15 w16se w16cid w16 w16cex w16sdtdh">
   <w:docDefaults>
     <w:rPrDefault>
       <w:rPr>
@@ -1332,7 +1538,7 @@
       </w:pPr>
     </w:pPrDefault>
   </w:docDefaults>
-  <w:latentStyles w:defLockedState="0" w:defUIPriority="99" w:defSemiHidden="0" w:defUnhideWhenUsed="0" w:defQFormat="0" w:count="371">
+  <w:latentStyles w:defLockedState="0" w:defUIPriority="99" w:defSemiHidden="0" w:defUnhideWhenUsed="0" w:defQFormat="0" w:count="376">
     <w:lsdException w:name="Normal" w:uiPriority="0" w:qFormat="1"/>
     <w:lsdException w:name="heading 1" w:uiPriority="9" w:qFormat="1"/>
     <w:lsdException w:name="heading 2" w:semiHidden="1" w:uiPriority="9" w:unhideWhenUsed="1" w:qFormat="1"/>
@@ -1438,7 +1644,6 @@
     <w:lsdException w:name="HTML Sample" w:semiHidden="1" w:unhideWhenUsed="1"/>
     <w:lsdException w:name="HTML Typewriter" w:semiHidden="1" w:unhideWhenUsed="1"/>
     <w:lsdException w:name="HTML Variable" w:semiHidden="1" w:unhideWhenUsed="1"/>
-    <w:lsdException w:name="Normal Table" w:semiHidden="1" w:unhideWhenUsed="1"/>
     <w:lsdException w:name="annotation subject" w:semiHidden="1" w:unhideWhenUsed="1"/>
     <w:lsdException w:name="No List" w:semiHidden="1" w:unhideWhenUsed="1"/>
     <w:lsdException w:name="Outline List 1" w:semiHidden="1" w:unhideWhenUsed="1"/>
@@ -1481,11 +1686,8 @@
     <w:lsdException w:name="Table Contemporary" w:semiHidden="1" w:unhideWhenUsed="1"/>
     <w:lsdException w:name="Table Elegant" w:semiHidden="1" w:unhideWhenUsed="1"/>
     <w:lsdException w:name="Table Professional" w:semiHidden="1" w:unhideWhenUsed="1"/>
-    <w:lsdException w:name="Table Subtle 1" w:semiHidden="1" w:unhideWhenUsed="1"/>
     <w:lsdException w:name="Table Subtle 2" w:semiHidden="1" w:unhideWhenUsed="1"/>
     <w:lsdException w:name="Table Web 1" w:semiHidden="1" w:unhideWhenUsed="1"/>
-    <w:lsdException w:name="Table Web 2" w:semiHidden="1" w:unhideWhenUsed="1"/>
-    <w:lsdException w:name="Table Web 3" w:semiHidden="1" w:unhideWhenUsed="1"/>
     <w:lsdException w:name="Balloon Text" w:semiHidden="1" w:unhideWhenUsed="1"/>
     <w:lsdException w:name="Table Grid" w:uiPriority="39"/>
     <w:lsdException w:name="Table Theme" w:semiHidden="1" w:unhideWhenUsed="1"/>
@@ -1704,6 +1906,11 @@
     <w:lsdException w:name="List Table 5 Dark Accent 6" w:uiPriority="50"/>
     <w:lsdException w:name="List Table 6 Colorful Accent 6" w:uiPriority="51"/>
     <w:lsdException w:name="List Table 7 Colorful Accent 6" w:uiPriority="52"/>
+    <w:lsdException w:name="Mention" w:semiHidden="1" w:unhideWhenUsed="1"/>
+    <w:lsdException w:name="Smart Hyperlink" w:semiHidden="1" w:unhideWhenUsed="1"/>
+    <w:lsdException w:name="Hashtag" w:semiHidden="1" w:unhideWhenUsed="1"/>
+    <w:lsdException w:name="Unresolved Mention" w:semiHidden="1" w:unhideWhenUsed="1"/>
+    <w:lsdException w:name="Smart Link" w:semiHidden="1" w:unhideWhenUsed="1"/>
   </w:latentStyles>
   <w:style w:type="paragraph" w:default="1" w:styleId="Normal">
     <w:name w:val="Normal"/>
@@ -1713,7 +1920,6 @@
   <w:style w:type="character" w:default="1" w:styleId="DefaultParagraphFont">
     <w:name w:val="Default Paragraph Font"/>
     <w:uiPriority w:val="1"/>
-    <w:semiHidden/>
     <w:unhideWhenUsed/>
   </w:style>
   <w:style w:type="table" w:default="1" w:styleId="TableNormal">

</xml_diff>

<commit_message>
update documents for repsonse
</commit_message>
<xml_diff>
--- a/Paper/Liver_Disease_Paper/Frontiers/Figures.docx
+++ b/Paper/Liver_Disease_Paper/Frontiers/Figures.docx
@@ -13,6 +13,7 @@
           <w:szCs w:val="16"/>
         </w:rPr>
       </w:pPr>
+      <w:bookmarkStart w:id="0" w:name="_Hlk106022559"/>
       <w:r>
         <w:rPr>
           <w:rFonts w:ascii="Arial" w:hAnsi="Arial" w:cs="Arial"/>
@@ -191,7 +192,7 @@
           </mc:Choice>
           <mc:Fallback>
             <w:pict>
-              <v:group w14:anchorId="6A1F61D5" id="Group 80" o:spid="_x0000_s1026" style="width:395.9pt;height:189.2pt;mso-position-horizontal-relative:char;mso-position-vertical-relative:line" coordsize="50277,24029" o:gfxdata="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">
+              <v:group w14:anchorId="2ACBE59D" id="Group 80" o:spid="_x0000_s1026" style="width:395.9pt;height:189.2pt;mso-position-horizontal-relative:char;mso-position-vertical-relative:line" coordsize="50277,24029" o:gfxdata="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">
                 <v:shapetype id="_x0000_t75" coordsize="21600,21600" o:spt="75" o:preferrelative="t" path="m@4@5l@4@11@9@11@9@5xe" filled="f" stroked="f">
                   <v:stroke joinstyle="miter"/>
                   <v:formulas>
@@ -262,6 +263,7 @@
           <w:szCs w:val="16"/>
         </w:rPr>
       </w:pPr>
+      <w:bookmarkStart w:id="1" w:name="_Hlk106022377"/>
       <w:r>
         <w:rPr>
           <w:rFonts w:ascii="Arial" w:hAnsi="Arial" w:cs="Arial"/>
@@ -349,7 +351,49 @@
           <w:sz w:val="16"/>
           <w:szCs w:val="16"/>
         </w:rPr>
-        <w:t xml:space="preserve"> Liver distributed into individual cubes of 32x120x120. </w:t>
+        <w:t xml:space="preserve"> Liver distributed into individual cubes of 32x120x120</w:t>
+      </w:r>
+      <w:r>
+        <w:rPr>
+          <w:rFonts w:ascii="Arial" w:hAnsi="Arial" w:cs="Arial"/>
+          <w:i w:val="0"/>
+          <w:color w:val="auto"/>
+          <w:sz w:val="16"/>
+          <w:szCs w:val="16"/>
+        </w:rPr>
+        <w:t xml:space="preserve"> (</w:t>
+      </w:r>
+      <w:proofErr w:type="spellStart"/>
+      <w:r>
+        <w:rPr>
+          <w:rFonts w:ascii="Arial" w:hAnsi="Arial" w:cs="Arial"/>
+          <w:i w:val="0"/>
+          <w:color w:val="auto"/>
+          <w:sz w:val="16"/>
+          <w:szCs w:val="16"/>
+        </w:rPr>
+        <w:t>LiTs</w:t>
+      </w:r>
+      <w:proofErr w:type="spellEnd"/>
+      <w:r>
+        <w:rPr>
+          <w:rFonts w:ascii="Arial" w:hAnsi="Arial" w:cs="Arial"/>
+          <w:i w:val="0"/>
+          <w:color w:val="auto"/>
+          <w:sz w:val="16"/>
+          <w:szCs w:val="16"/>
+        </w:rPr>
+        <w:t xml:space="preserve"> volume 108)</w:t>
+      </w:r>
+      <w:r>
+        <w:rPr>
+          <w:rFonts w:ascii="Arial" w:hAnsi="Arial" w:cs="Arial"/>
+          <w:i w:val="0"/>
+          <w:color w:val="auto"/>
+          <w:sz w:val="16"/>
+          <w:szCs w:val="16"/>
+        </w:rPr>
+        <w:t xml:space="preserve">. </w:t>
       </w:r>
       <w:r>
         <w:rPr>
@@ -484,6 +528,8 @@
         <w:t>, with the entire liver being passed at once for evaluation and testing.</w:t>
       </w:r>
     </w:p>
+    <w:bookmarkEnd w:id="0"/>
+    <w:bookmarkEnd w:id="1"/>
     <w:p>
       <w:pPr>
         <w:keepNext/>

</xml_diff>